<commit_message>
Expand YouTube tags to 489 characters
Co-Authored-By: Claude Opus 5.5 <noreply@anthropic.com>
Claude-Session: https://claude.ai/code/session_017NaULEfswnPruD2ZBJhwby
</commit_message>
<xml_diff>
--- a/UpscoreTech_SMM_YouTube_Package.docx
+++ b/UpscoreTech_SMM_YouTube_Package.docx
@@ -799,7 +799,7 @@
           <w:iCs/>
           <w:color w:val="555555"/>
         </w:rPr>
-        <w:t xml:space="preserve">YouTube’s tag limit is 500 characters in total (characters, not words). This set is 396 characters.</w:t>
+        <w:t xml:space="preserve">YouTube’s tag limit is 500 characters in total (characters, not words). This set is 489 characters.</w:t>
       </w:r>
     </w:p>
     <w:tbl>
@@ -845,7 +845,7 @@
                 <w:sz w:val="22"/>
                 <w:szCs w:val="22"/>
               </w:rPr>
-              <w:t xml:space="preserve">social media management, social media management services, social media management for small business, social media manager, done for you social media, social media marketing agency, social media marketing, content calendar, instagram reels, content creation, small business marketing, digital marketing agency, social media strategy, lead generation, UpscoreTech, marketing agency Padova, Shorts</w:t>
+              <w:t xml:space="preserve">social media management, social media management services, social media management for small business, social media manager, done for you social media, social media marketing agency, social media marketing, content calendar, instagram reels, youtube shorts, content creation, small business marketing, digital marketing agency, social media strategy, lead generation, community management, reels editing, facebook marketing, linkedin marketing, UpscoreTech, marketing agency Padova, Shorts</w:t>
             </w:r>
           </w:p>
         </w:tc>
@@ -985,7 +985,7 @@
         </w:numPr>
         <w:spacing w:after="60"/>
       </w:pPr>
-      <w:hyperlink w:history="1" r:id="rId2fagrfnixm1dr7p8ht-qv">
+      <w:hyperlink w:history="1" r:id="rIdczx53jrwmupgmmdvbsutr">
         <w:r>
           <w:rPr>
             <w:rStyle w:val="Hyperlink"/>
@@ -1003,7 +1003,7 @@
         </w:numPr>
         <w:spacing w:after="60"/>
       </w:pPr>
-      <w:hyperlink w:history="1" r:id="rIdlcnz0ecxql_jgpqgcs3h2">
+      <w:hyperlink w:history="1" r:id="rIdtvvs2fjkfvkyiow3btn_c">
         <w:r>
           <w:rPr>
             <w:rStyle w:val="Hyperlink"/>
@@ -1021,7 +1021,7 @@
         </w:numPr>
         <w:spacing w:after="60"/>
       </w:pPr>
-      <w:hyperlink w:history="1" r:id="rIdvzmo6vlcd84chz5hlk8df">
+      <w:hyperlink w:history="1" r:id="rIdc73bvouwm0e9h13y1xqmc">
         <w:r>
           <w:rPr>
             <w:rStyle w:val="Hyperlink"/>
@@ -1039,7 +1039,7 @@
         </w:numPr>
         <w:spacing w:after="60"/>
       </w:pPr>
-      <w:hyperlink w:history="1" r:id="rIdzzspr7tabx45nvjp438r5">
+      <w:hyperlink w:history="1" r:id="rIdj-fdu49opf5dilewyjfal">
         <w:r>
           <w:rPr>
             <w:rStyle w:val="Hyperlink"/>
@@ -1057,7 +1057,7 @@
         </w:numPr>
         <w:spacing w:after="60"/>
       </w:pPr>
-      <w:hyperlink w:history="1" r:id="rIdvexlggku3mvureoahwqzy">
+      <w:hyperlink w:history="1" r:id="rIdsmgbwv2_i6ylwg6vrsiut">
         <w:r>
           <w:rPr>
             <w:rStyle w:val="Hyperlink"/>
@@ -1075,7 +1075,7 @@
         </w:numPr>
         <w:spacing w:after="60"/>
       </w:pPr>
-      <w:hyperlink w:history="1" r:id="rIdnkay9id6okqbvwdf89g58">
+      <w:hyperlink w:history="1" r:id="rIdf890tianq3nymrzrcxbpe">
         <w:r>
           <w:rPr>
             <w:rStyle w:val="Hyperlink"/>

</xml_diff>